<commit_message>
fix(report): alinear anchos de la tabla de evidencias
</commit_message>
<xml_diff>
--- a/output/docx/Varillas_LP2_S8_Practica.docx
+++ b/output/docx/Varillas_LP2_S8_Practica.docx
@@ -31,21 +31,21 @@
     </w:p>
     <w:tbl>
       <w:tblPr>
-        <w:tblW w:type="auto" w:w="0"/>
-        <w:jc w:val="center"/>
+        <w:tblW w:type="dxa" w:w="10008"/>
+        <w:jc w:val="left"/>
         <w:tblLayout w:type="fixed"/>
         <w:tblLook w:firstColumn="1" w:firstRow="1" w:lastColumn="0" w:lastRow="0" w:noHBand="0" w:noVBand="1" w:val="04A0"/>
       </w:tblPr>
       <w:tblGrid>
-        <w:gridCol w:w="2541"/>
-        <w:gridCol w:w="2541"/>
-        <w:gridCol w:w="2541"/>
-        <w:gridCol w:w="2541"/>
+        <w:gridCol w:w="1368"/>
+        <w:gridCol w:w="3312"/>
+        <w:gridCol w:w="1512"/>
+        <w:gridCol w:w="3816"/>
       </w:tblGrid>
       <w:tr>
         <w:tc>
           <w:tcPr>
-            <w:tcW w:type="dxa" w:w="1440"/>
+            <w:tcW w:type="dxa" w:w="1368"/>
             <w:tcBorders>
               <w:top w:val="single" w:sz="8" w:color="BDD0E0"/>
               <w:left w:val="single" w:sz="8" w:color="BDD0E0"/>
@@ -68,7 +68,7 @@
         </w:tc>
         <w:tc>
           <w:tcPr>
-            <w:tcW w:type="dxa" w:w="3240"/>
+            <w:tcW w:type="dxa" w:w="3312"/>
             <w:tcBorders>
               <w:top w:val="single" w:sz="8" w:color="BDD0E0"/>
               <w:left w:val="single" w:sz="8" w:color="BDD0E0"/>
@@ -89,7 +89,7 @@
         </w:tc>
         <w:tc>
           <w:tcPr>
-            <w:tcW w:type="dxa" w:w="1728"/>
+            <w:tcW w:type="dxa" w:w="1512"/>
             <w:tcBorders>
               <w:top w:val="single" w:sz="8" w:color="BDD0E0"/>
               <w:left w:val="single" w:sz="8" w:color="BDD0E0"/>
@@ -112,7 +112,7 @@
         </w:tc>
         <w:tc>
           <w:tcPr>
-            <w:tcW w:type="dxa" w:w="3600"/>
+            <w:tcW w:type="dxa" w:w="3816"/>
             <w:tcBorders>
               <w:top w:val="single" w:sz="8" w:color="BDD0E0"/>
               <w:left w:val="single" w:sz="8" w:color="BDD0E0"/>
@@ -135,7 +135,7 @@
       <w:tr>
         <w:tc>
           <w:tcPr>
-            <w:tcW w:type="dxa" w:w="1440"/>
+            <w:tcW w:type="dxa" w:w="1368"/>
             <w:tcBorders>
               <w:top w:val="single" w:sz="8" w:color="BDD0E0"/>
               <w:left w:val="single" w:sz="8" w:color="BDD0E0"/>
@@ -158,7 +158,7 @@
         </w:tc>
         <w:tc>
           <w:tcPr>
-            <w:tcW w:type="dxa" w:w="3240"/>
+            <w:tcW w:type="dxa" w:w="3312"/>
             <w:tcBorders>
               <w:top w:val="single" w:sz="8" w:color="BDD0E0"/>
               <w:left w:val="single" w:sz="8" w:color="BDD0E0"/>
@@ -179,7 +179,7 @@
         </w:tc>
         <w:tc>
           <w:tcPr>
-            <w:tcW w:type="dxa" w:w="1728"/>
+            <w:tcW w:type="dxa" w:w="1512"/>
             <w:tcBorders>
               <w:top w:val="single" w:sz="8" w:color="BDD0E0"/>
               <w:left w:val="single" w:sz="8" w:color="BDD0E0"/>
@@ -202,7 +202,7 @@
         </w:tc>
         <w:tc>
           <w:tcPr>
-            <w:tcW w:type="dxa" w:w="3600"/>
+            <w:tcW w:type="dxa" w:w="3816"/>
             <w:tcBorders>
               <w:top w:val="single" w:sz="8" w:color="BDD0E0"/>
               <w:left w:val="single" w:sz="8" w:color="BDD0E0"/>
@@ -225,7 +225,7 @@
       <w:tr>
         <w:tc>
           <w:tcPr>
-            <w:tcW w:type="dxa" w:w="1440"/>
+            <w:tcW w:type="dxa" w:w="1368"/>
             <w:tcBorders>
               <w:top w:val="single" w:sz="8" w:color="BDD0E0"/>
               <w:left w:val="single" w:sz="8" w:color="BDD0E0"/>
@@ -248,7 +248,7 @@
         </w:tc>
         <w:tc>
           <w:tcPr>
-            <w:tcW w:type="dxa" w:w="3240"/>
+            <w:tcW w:type="dxa" w:w="3312"/>
             <w:tcBorders>
               <w:top w:val="single" w:sz="8" w:color="BDD0E0"/>
               <w:left w:val="single" w:sz="8" w:color="BDD0E0"/>
@@ -269,7 +269,7 @@
         </w:tc>
         <w:tc>
           <w:tcPr>
-            <w:tcW w:type="dxa" w:w="1728"/>
+            <w:tcW w:type="dxa" w:w="1512"/>
             <w:tcBorders>
               <w:top w:val="single" w:sz="8" w:color="BDD0E0"/>
               <w:left w:val="single" w:sz="8" w:color="BDD0E0"/>
@@ -292,7 +292,7 @@
         </w:tc>
         <w:tc>
           <w:tcPr>
-            <w:tcW w:type="dxa" w:w="3600"/>
+            <w:tcW w:type="dxa" w:w="3816"/>
             <w:tcBorders>
               <w:top w:val="single" w:sz="8" w:color="BDD0E0"/>
               <w:left w:val="single" w:sz="8" w:color="BDD0E0"/>
@@ -406,20 +406,20 @@
     </w:p>
     <w:tbl>
       <w:tblPr>
-        <w:tblW w:type="auto" w:w="0"/>
-        <w:jc w:val="center"/>
+        <w:tblW w:type="dxa" w:w="10008"/>
+        <w:jc w:val="left"/>
         <w:tblLayout w:type="fixed"/>
         <w:tblLook w:firstColumn="1" w:firstRow="1" w:lastColumn="0" w:lastRow="0" w:noHBand="0" w:noVBand="1" w:val="04A0"/>
       </w:tblPr>
       <w:tblGrid>
-        <w:gridCol w:w="648"/>
-        <w:gridCol w:w="3744"/>
-        <w:gridCol w:w="5616"/>
+        <w:gridCol w:w="749"/>
+        <w:gridCol w:w="3528"/>
+        <w:gridCol w:w="5731"/>
       </w:tblGrid>
       <w:tr>
         <w:tc>
           <w:tcPr>
-            <w:tcW w:type="dxa" w:w="3389"/>
+            <w:tcW w:type="dxa" w:w="749"/>
             <w:shd w:fill="17365D"/>
             <w:tcBorders>
               <w:top w:val="single" w:sz="4" w:color="FFFFFF"/>
@@ -431,6 +431,9 @@
             </w:tcBorders>
           </w:tcPr>
           <w:p>
+            <w:pPr>
+              <w:jc w:val="center"/>
+            </w:pPr>
             <w:r>
               <w:rPr>
                 <w:b/>
@@ -443,7 +446,7 @@
         </w:tc>
         <w:tc>
           <w:tcPr>
-            <w:tcW w:type="dxa" w:w="3389"/>
+            <w:tcW w:type="dxa" w:w="3528"/>
             <w:shd w:fill="17365D"/>
             <w:tcBorders>
               <w:top w:val="single" w:sz="4" w:color="FFFFFF"/>
@@ -467,7 +470,7 @@
         </w:tc>
         <w:tc>
           <w:tcPr>
-            <w:tcW w:type="dxa" w:w="3389"/>
+            <w:tcW w:type="dxa" w:w="5731"/>
             <w:shd w:fill="17365D"/>
             <w:tcBorders>
               <w:top w:val="single" w:sz="4" w:color="FFFFFF"/>
@@ -493,7 +496,7 @@
       <w:tr>
         <w:tc>
           <w:tcPr>
-            <w:tcW w:type="dxa" w:w="648"/>
+            <w:tcW w:type="dxa" w:w="749"/>
             <w:tcBorders>
               <w:top w:val="single" w:sz="8" w:color="BDD0E0"/>
               <w:left w:val="single" w:sz="8" w:color="BDD0E0"/>
@@ -504,6 +507,9 @@
             </w:tcBorders>
           </w:tcPr>
           <w:p>
+            <w:pPr>
+              <w:jc w:val="center"/>
+            </w:pPr>
             <w:r>
               <w:rPr>
                 <w:sz w:val="16"/>
@@ -514,7 +520,7 @@
         </w:tc>
         <w:tc>
           <w:tcPr>
-            <w:tcW w:type="dxa" w:w="3744"/>
+            <w:tcW w:type="dxa" w:w="3528"/>
             <w:tcBorders>
               <w:top w:val="single" w:sz="8" w:color="BDD0E0"/>
               <w:left w:val="single" w:sz="8" w:color="BDD0E0"/>
@@ -535,7 +541,7 @@
         </w:tc>
         <w:tc>
           <w:tcPr>
-            <w:tcW w:type="dxa" w:w="5616"/>
+            <w:tcW w:type="dxa" w:w="5731"/>
             <w:tcBorders>
               <w:top w:val="single" w:sz="8" w:color="BDD0E0"/>
               <w:left w:val="single" w:sz="8" w:color="BDD0E0"/>
@@ -558,7 +564,7 @@
       <w:tr>
         <w:tc>
           <w:tcPr>
-            <w:tcW w:type="dxa" w:w="648"/>
+            <w:tcW w:type="dxa" w:w="749"/>
             <w:tcBorders>
               <w:top w:val="single" w:sz="8" w:color="BDD0E0"/>
               <w:left w:val="single" w:sz="8" w:color="BDD0E0"/>
@@ -570,6 +576,9 @@
             <w:shd w:fill="F3F6FA"/>
           </w:tcPr>
           <w:p>
+            <w:pPr>
+              <w:jc w:val="center"/>
+            </w:pPr>
             <w:r>
               <w:rPr>
                 <w:sz w:val="16"/>
@@ -580,7 +589,7 @@
         </w:tc>
         <w:tc>
           <w:tcPr>
-            <w:tcW w:type="dxa" w:w="3744"/>
+            <w:tcW w:type="dxa" w:w="3528"/>
             <w:tcBorders>
               <w:top w:val="single" w:sz="8" w:color="BDD0E0"/>
               <w:left w:val="single" w:sz="8" w:color="BDD0E0"/>
@@ -602,7 +611,7 @@
         </w:tc>
         <w:tc>
           <w:tcPr>
-            <w:tcW w:type="dxa" w:w="5616"/>
+            <w:tcW w:type="dxa" w:w="5731"/>
             <w:tcBorders>
               <w:top w:val="single" w:sz="8" w:color="BDD0E0"/>
               <w:left w:val="single" w:sz="8" w:color="BDD0E0"/>
@@ -626,7 +635,7 @@
       <w:tr>
         <w:tc>
           <w:tcPr>
-            <w:tcW w:type="dxa" w:w="648"/>
+            <w:tcW w:type="dxa" w:w="749"/>
             <w:tcBorders>
               <w:top w:val="single" w:sz="8" w:color="BDD0E0"/>
               <w:left w:val="single" w:sz="8" w:color="BDD0E0"/>
@@ -637,6 +646,9 @@
             </w:tcBorders>
           </w:tcPr>
           <w:p>
+            <w:pPr>
+              <w:jc w:val="center"/>
+            </w:pPr>
             <w:r>
               <w:rPr>
                 <w:sz w:val="16"/>
@@ -647,7 +659,7 @@
         </w:tc>
         <w:tc>
           <w:tcPr>
-            <w:tcW w:type="dxa" w:w="3744"/>
+            <w:tcW w:type="dxa" w:w="3528"/>
             <w:tcBorders>
               <w:top w:val="single" w:sz="8" w:color="BDD0E0"/>
               <w:left w:val="single" w:sz="8" w:color="BDD0E0"/>
@@ -668,7 +680,7 @@
         </w:tc>
         <w:tc>
           <w:tcPr>
-            <w:tcW w:type="dxa" w:w="5616"/>
+            <w:tcW w:type="dxa" w:w="5731"/>
             <w:tcBorders>
               <w:top w:val="single" w:sz="8" w:color="BDD0E0"/>
               <w:left w:val="single" w:sz="8" w:color="BDD0E0"/>
@@ -691,7 +703,7 @@
       <w:tr>
         <w:tc>
           <w:tcPr>
-            <w:tcW w:type="dxa" w:w="648"/>
+            <w:tcW w:type="dxa" w:w="749"/>
             <w:tcBorders>
               <w:top w:val="single" w:sz="8" w:color="BDD0E0"/>
               <w:left w:val="single" w:sz="8" w:color="BDD0E0"/>
@@ -703,6 +715,9 @@
             <w:shd w:fill="F3F6FA"/>
           </w:tcPr>
           <w:p>
+            <w:pPr>
+              <w:jc w:val="center"/>
+            </w:pPr>
             <w:r>
               <w:rPr>
                 <w:sz w:val="16"/>
@@ -713,7 +728,7 @@
         </w:tc>
         <w:tc>
           <w:tcPr>
-            <w:tcW w:type="dxa" w:w="3744"/>
+            <w:tcW w:type="dxa" w:w="3528"/>
             <w:tcBorders>
               <w:top w:val="single" w:sz="8" w:color="BDD0E0"/>
               <w:left w:val="single" w:sz="8" w:color="BDD0E0"/>
@@ -735,7 +750,7 @@
         </w:tc>
         <w:tc>
           <w:tcPr>
-            <w:tcW w:type="dxa" w:w="5616"/>
+            <w:tcW w:type="dxa" w:w="5731"/>
             <w:tcBorders>
               <w:top w:val="single" w:sz="8" w:color="BDD0E0"/>
               <w:left w:val="single" w:sz="8" w:color="BDD0E0"/>
@@ -759,7 +774,7 @@
       <w:tr>
         <w:tc>
           <w:tcPr>
-            <w:tcW w:type="dxa" w:w="648"/>
+            <w:tcW w:type="dxa" w:w="749"/>
             <w:tcBorders>
               <w:top w:val="single" w:sz="8" w:color="BDD0E0"/>
               <w:left w:val="single" w:sz="8" w:color="BDD0E0"/>
@@ -770,6 +785,9 @@
             </w:tcBorders>
           </w:tcPr>
           <w:p>
+            <w:pPr>
+              <w:jc w:val="center"/>
+            </w:pPr>
             <w:r>
               <w:rPr>
                 <w:sz w:val="16"/>
@@ -780,7 +798,7 @@
         </w:tc>
         <w:tc>
           <w:tcPr>
-            <w:tcW w:type="dxa" w:w="3744"/>
+            <w:tcW w:type="dxa" w:w="3528"/>
             <w:tcBorders>
               <w:top w:val="single" w:sz="8" w:color="BDD0E0"/>
               <w:left w:val="single" w:sz="8" w:color="BDD0E0"/>
@@ -801,7 +819,7 @@
         </w:tc>
         <w:tc>
           <w:tcPr>
-            <w:tcW w:type="dxa" w:w="5616"/>
+            <w:tcW w:type="dxa" w:w="5731"/>
             <w:tcBorders>
               <w:top w:val="single" w:sz="8" w:color="BDD0E0"/>
               <w:left w:val="single" w:sz="8" w:color="BDD0E0"/>
@@ -824,7 +842,7 @@
       <w:tr>
         <w:tc>
           <w:tcPr>
-            <w:tcW w:type="dxa" w:w="648"/>
+            <w:tcW w:type="dxa" w:w="749"/>
             <w:tcBorders>
               <w:top w:val="single" w:sz="8" w:color="BDD0E0"/>
               <w:left w:val="single" w:sz="8" w:color="BDD0E0"/>
@@ -836,6 +854,9 @@
             <w:shd w:fill="F3F6FA"/>
           </w:tcPr>
           <w:p>
+            <w:pPr>
+              <w:jc w:val="center"/>
+            </w:pPr>
             <w:r>
               <w:rPr>
                 <w:sz w:val="16"/>
@@ -846,7 +867,7 @@
         </w:tc>
         <w:tc>
           <w:tcPr>
-            <w:tcW w:type="dxa" w:w="3744"/>
+            <w:tcW w:type="dxa" w:w="3528"/>
             <w:tcBorders>
               <w:top w:val="single" w:sz="8" w:color="BDD0E0"/>
               <w:left w:val="single" w:sz="8" w:color="BDD0E0"/>
@@ -868,7 +889,7 @@
         </w:tc>
         <w:tc>
           <w:tcPr>
-            <w:tcW w:type="dxa" w:w="5616"/>
+            <w:tcW w:type="dxa" w:w="5731"/>
             <w:tcBorders>
               <w:top w:val="single" w:sz="8" w:color="BDD0E0"/>
               <w:left w:val="single" w:sz="8" w:color="BDD0E0"/>
@@ -892,7 +913,7 @@
       <w:tr>
         <w:tc>
           <w:tcPr>
-            <w:tcW w:type="dxa" w:w="648"/>
+            <w:tcW w:type="dxa" w:w="749"/>
             <w:tcBorders>
               <w:top w:val="single" w:sz="8" w:color="BDD0E0"/>
               <w:left w:val="single" w:sz="8" w:color="BDD0E0"/>
@@ -903,6 +924,9 @@
             </w:tcBorders>
           </w:tcPr>
           <w:p>
+            <w:pPr>
+              <w:jc w:val="center"/>
+            </w:pPr>
             <w:r>
               <w:rPr>
                 <w:sz w:val="16"/>
@@ -913,7 +937,7 @@
         </w:tc>
         <w:tc>
           <w:tcPr>
-            <w:tcW w:type="dxa" w:w="3744"/>
+            <w:tcW w:type="dxa" w:w="3528"/>
             <w:tcBorders>
               <w:top w:val="single" w:sz="8" w:color="BDD0E0"/>
               <w:left w:val="single" w:sz="8" w:color="BDD0E0"/>
@@ -934,7 +958,7 @@
         </w:tc>
         <w:tc>
           <w:tcPr>
-            <w:tcW w:type="dxa" w:w="5616"/>
+            <w:tcW w:type="dxa" w:w="5731"/>
             <w:tcBorders>
               <w:top w:val="single" w:sz="8" w:color="BDD0E0"/>
               <w:left w:val="single" w:sz="8" w:color="BDD0E0"/>
@@ -957,7 +981,7 @@
       <w:tr>
         <w:tc>
           <w:tcPr>
-            <w:tcW w:type="dxa" w:w="648"/>
+            <w:tcW w:type="dxa" w:w="749"/>
             <w:tcBorders>
               <w:top w:val="single" w:sz="8" w:color="BDD0E0"/>
               <w:left w:val="single" w:sz="8" w:color="BDD0E0"/>
@@ -969,6 +993,9 @@
             <w:shd w:fill="F3F6FA"/>
           </w:tcPr>
           <w:p>
+            <w:pPr>
+              <w:jc w:val="center"/>
+            </w:pPr>
             <w:r>
               <w:rPr>
                 <w:sz w:val="16"/>
@@ -979,7 +1006,7 @@
         </w:tc>
         <w:tc>
           <w:tcPr>
-            <w:tcW w:type="dxa" w:w="3744"/>
+            <w:tcW w:type="dxa" w:w="3528"/>
             <w:tcBorders>
               <w:top w:val="single" w:sz="8" w:color="BDD0E0"/>
               <w:left w:val="single" w:sz="8" w:color="BDD0E0"/>
@@ -1001,7 +1028,7 @@
         </w:tc>
         <w:tc>
           <w:tcPr>
-            <w:tcW w:type="dxa" w:w="5616"/>
+            <w:tcW w:type="dxa" w:w="5731"/>
             <w:tcBorders>
               <w:top w:val="single" w:sz="8" w:color="BDD0E0"/>
               <w:left w:val="single" w:sz="8" w:color="BDD0E0"/>
@@ -1025,7 +1052,7 @@
       <w:tr>
         <w:tc>
           <w:tcPr>
-            <w:tcW w:type="dxa" w:w="648"/>
+            <w:tcW w:type="dxa" w:w="749"/>
             <w:tcBorders>
               <w:top w:val="single" w:sz="8" w:color="BDD0E0"/>
               <w:left w:val="single" w:sz="8" w:color="BDD0E0"/>
@@ -1036,6 +1063,9 @@
             </w:tcBorders>
           </w:tcPr>
           <w:p>
+            <w:pPr>
+              <w:jc w:val="center"/>
+            </w:pPr>
             <w:r>
               <w:rPr>
                 <w:sz w:val="16"/>
@@ -1046,7 +1076,7 @@
         </w:tc>
         <w:tc>
           <w:tcPr>
-            <w:tcW w:type="dxa" w:w="3744"/>
+            <w:tcW w:type="dxa" w:w="3528"/>
             <w:tcBorders>
               <w:top w:val="single" w:sz="8" w:color="BDD0E0"/>
               <w:left w:val="single" w:sz="8" w:color="BDD0E0"/>
@@ -1067,7 +1097,7 @@
         </w:tc>
         <w:tc>
           <w:tcPr>
-            <w:tcW w:type="dxa" w:w="5616"/>
+            <w:tcW w:type="dxa" w:w="5731"/>
             <w:tcBorders>
               <w:top w:val="single" w:sz="8" w:color="BDD0E0"/>
               <w:left w:val="single" w:sz="8" w:color="BDD0E0"/>
@@ -1090,7 +1120,7 @@
       <w:tr>
         <w:tc>
           <w:tcPr>
-            <w:tcW w:type="dxa" w:w="648"/>
+            <w:tcW w:type="dxa" w:w="749"/>
             <w:tcBorders>
               <w:top w:val="single" w:sz="8" w:color="BDD0E0"/>
               <w:left w:val="single" w:sz="8" w:color="BDD0E0"/>
@@ -1102,6 +1132,9 @@
             <w:shd w:fill="F3F6FA"/>
           </w:tcPr>
           <w:p>
+            <w:pPr>
+              <w:jc w:val="center"/>
+            </w:pPr>
             <w:r>
               <w:rPr>
                 <w:sz w:val="16"/>
@@ -1112,7 +1145,7 @@
         </w:tc>
         <w:tc>
           <w:tcPr>
-            <w:tcW w:type="dxa" w:w="3744"/>
+            <w:tcW w:type="dxa" w:w="3528"/>
             <w:tcBorders>
               <w:top w:val="single" w:sz="8" w:color="BDD0E0"/>
               <w:left w:val="single" w:sz="8" w:color="BDD0E0"/>
@@ -1134,7 +1167,7 @@
         </w:tc>
         <w:tc>
           <w:tcPr>
-            <w:tcW w:type="dxa" w:w="5616"/>
+            <w:tcW w:type="dxa" w:w="5731"/>
             <w:tcBorders>
               <w:top w:val="single" w:sz="8" w:color="BDD0E0"/>
               <w:left w:val="single" w:sz="8" w:color="BDD0E0"/>
@@ -1158,7 +1191,7 @@
       <w:tr>
         <w:tc>
           <w:tcPr>
-            <w:tcW w:type="dxa" w:w="648"/>
+            <w:tcW w:type="dxa" w:w="749"/>
             <w:tcBorders>
               <w:top w:val="single" w:sz="8" w:color="BDD0E0"/>
               <w:left w:val="single" w:sz="8" w:color="BDD0E0"/>
@@ -1169,6 +1202,9 @@
             </w:tcBorders>
           </w:tcPr>
           <w:p>
+            <w:pPr>
+              <w:jc w:val="center"/>
+            </w:pPr>
             <w:r>
               <w:rPr>
                 <w:sz w:val="16"/>
@@ -1179,7 +1215,7 @@
         </w:tc>
         <w:tc>
           <w:tcPr>
-            <w:tcW w:type="dxa" w:w="3744"/>
+            <w:tcW w:type="dxa" w:w="3528"/>
             <w:tcBorders>
               <w:top w:val="single" w:sz="8" w:color="BDD0E0"/>
               <w:left w:val="single" w:sz="8" w:color="BDD0E0"/>
@@ -1200,7 +1236,7 @@
         </w:tc>
         <w:tc>
           <w:tcPr>
-            <w:tcW w:type="dxa" w:w="5616"/>
+            <w:tcW w:type="dxa" w:w="5731"/>
             <w:tcBorders>
               <w:top w:val="single" w:sz="8" w:color="BDD0E0"/>
               <w:left w:val="single" w:sz="8" w:color="BDD0E0"/>
@@ -1223,7 +1259,7 @@
       <w:tr>
         <w:tc>
           <w:tcPr>
-            <w:tcW w:type="dxa" w:w="648"/>
+            <w:tcW w:type="dxa" w:w="749"/>
             <w:tcBorders>
               <w:top w:val="single" w:sz="8" w:color="BDD0E0"/>
               <w:left w:val="single" w:sz="8" w:color="BDD0E0"/>
@@ -1235,6 +1271,9 @@
             <w:shd w:fill="F3F6FA"/>
           </w:tcPr>
           <w:p>
+            <w:pPr>
+              <w:jc w:val="center"/>
+            </w:pPr>
             <w:r>
               <w:rPr>
                 <w:sz w:val="16"/>
@@ -1245,7 +1284,7 @@
         </w:tc>
         <w:tc>
           <w:tcPr>
-            <w:tcW w:type="dxa" w:w="3744"/>
+            <w:tcW w:type="dxa" w:w="3528"/>
             <w:tcBorders>
               <w:top w:val="single" w:sz="8" w:color="BDD0E0"/>
               <w:left w:val="single" w:sz="8" w:color="BDD0E0"/>
@@ -1267,7 +1306,7 @@
         </w:tc>
         <w:tc>
           <w:tcPr>
-            <w:tcW w:type="dxa" w:w="5616"/>
+            <w:tcW w:type="dxa" w:w="5731"/>
             <w:tcBorders>
               <w:top w:val="single" w:sz="8" w:color="BDD0E0"/>
               <w:left w:val="single" w:sz="8" w:color="BDD0E0"/>

</xml_diff>